<commit_message>
TV2: bo vien dan tai lieu noi bo, bo sung tai lieu tham khao
- Hai cau trong than bai vien dan 'Tai lieu phan cong cua nhom' -> doi
  sang cach dien dat theo tai lieu chuan
- Tai lieu tham khao tu 2 muc (1 muc la tai lieu noi bo) len 5 nguon that:
  Silberschatz, Tanenbaum, Stallings, Coffman 1971, Dijkstra 1965
</commit_message>
<xml_diff>
--- a/report/chuong-1-tv2/TV2_Chuong_1_Tong_quan_Deadlock_Banker.docx
+++ b/report/chuong-1-tv2/TV2_Chuong_1_Tong_quan_Deadlock_Banker.docx
@@ -778,7 +778,7 @@
         <w:ind w:firstLine="567"/>
       </w:pPr>
       <w:r>
-        <w:t>Tài liệu phân công của nhóm xác định bốn hướng xử lý cần trình bày: bỏ qua vấn đề Deadlock, phòng ngừa Deadlock, tránh Deadlock, và phát hiện rồi khôi phục. Mỗi hướng có cách tiếp cận và chi phí khác nhau.</w:t>
+        <w:t>Theo cách phân loại kinh điển, có bốn hướng xử lý Deadlock: bỏ qua vấn đề Deadlock, phòng ngừa Deadlock, tránh Deadlock, và phát hiện rồi khôi phục. Mỗi hướng có ưu nhược điểm riêng và phù hợp với những bối cảnh hệ thống khác nhau.</w:t>
       </w:r>
     </w:p>
     <w:p>
@@ -864,7 +864,7 @@
         <w:ind w:firstLine="567"/>
       </w:pPr>
       <w:r>
-        <w:t>Trong phạm vi tài liệu của nhóm, đây được nêu là cách tiếp cận thường gặp ở các hệ điều hành phổ biến khi việc kiểm soát Deadlock tổng quát quá tốn kém hoặc không phù hợp với mọi loại tài nguyên.</w:t>
+        <w:t>Đây là cách tiếp cận được nhiều hệ điều hành phổ biến áp dụng trên thực tế, khi chi phí kiểm soát Deadlock tổng quát lớn hơn thiệt hại mà Deadlock gây ra. Tên gọi thuật toán đà điểu bắt nguồn từ hình ảnh con đà điểu vùi đầu xuống cát để phớt lờ nguy hiểm.</w:t>
       </w:r>
     </w:p>
     <w:p>
@@ -1161,12 +1161,30 @@
       </w:r>
     </w:p>
     <w:p>
+      <w:pPr/>
+      <w:r>
+        <w:t>[3] William Stallings, Operating Systems: Internals and Design Principles, chương Concurrency: Deadlock and Starvation.</w:t>
+      </w:r>
+    </w:p>
+    <w:p>
+      <w:pPr/>
+      <w:r>
+        <w:t>[4] E. G. Coffman, M. J. Elphick, A. Shoshani, System Deadlocks, ACM Computing Surveys, 1971.</w:t>
+      </w:r>
+    </w:p>
+    <w:p>
+      <w:pPr/>
+      <w:r>
+        <w:t>[5] E. W. Dijkstra, Cooperating Sequential Processes, 1965 — nguồn gốc của giải thuật Banker.</w:t>
+      </w:r>
+    </w:p>
+    <w:p>
       <w:pPr>
         <w:spacing w:after="120"/>
         <w:ind w:left="283"/>
       </w:pPr>
       <w:r>
-        <w:t>[2] Tài liệu phân công Đề tài 9 - Deadlock: Giải thuật Banker của nhóm, các mục TV2 và Nội dung kỹ thuật lõi.</w:t>
+        <w:t>[2] Andrew S. Tanenbaum, Herbert Bos, Modern Operating Systems, chương Deadlocks.</w:t>
       </w:r>
     </w:p>
     <w:sectPr>

</xml_diff>